<commit_message>
UI y Docs: Actualizacion de zonas horarias EU y nuevos CVs
</commit_message>
<xml_diff>
--- a/cv/Jose_Cruz_CV_EN.docx
+++ b/cv/Jose_Cruz_CV_EN.docx
@@ -39,7 +39,23 @@
           <w:kern w:val="0"/>
           <w14:ligatures w14:val="none"/>
         </w:rPr>
-        <w:t xml:space="preserve">Mexico City, Mexico | 5613380803 | josej.cruzb@gmail.com | </w:t>
+        <w:t>Mexico City, Mexico | 5613380803 | jose</w:t>
+      </w:r>
+      <w:r>
+        <w:rPr>
+          <w:rFonts w:ascii="Times New Roman" w:eastAsia="Times New Roman" w:hAnsi="Times New Roman" w:cs="Times New Roman"/>
+          <w:kern w:val="0"/>
+          <w14:ligatures w14:val="none"/>
+        </w:rPr>
+        <w:t>@cruztelecom</w:t>
+      </w:r>
+      <w:r>
+        <w:rPr>
+          <w:rFonts w:ascii="Times New Roman" w:eastAsia="Times New Roman" w:hAnsi="Times New Roman" w:cs="Times New Roman"/>
+          <w:kern w:val="0"/>
+          <w14:ligatures w14:val="none"/>
+        </w:rPr>
+        <w:t xml:space="preserve">.com | </w:t>
       </w:r>
       <w:hyperlink r:id="rId5" w:history="1">
         <w:r>
@@ -261,6 +277,17 @@
         </w:rPr>
         <w:t xml:space="preserve"> </w:t>
       </w:r>
+    </w:p>
+    <w:p>
+      <w:pPr>
+        <w:spacing w:line="240" w:lineRule="auto"/>
+        <w:jc w:val="both"/>
+        <w:rPr>
+          <w:rFonts w:ascii="Times New Roman" w:eastAsia="Times New Roman" w:hAnsi="Times New Roman" w:cs="Times New Roman"/>
+          <w:kern w:val="0"/>
+          <w14:ligatures w14:val="none"/>
+        </w:rPr>
+      </w:pPr>
       <w:r>
         <w:rPr>
           <w:rFonts w:ascii="Times New Roman" w:eastAsia="Times New Roman" w:hAnsi="Times New Roman" w:cs="Times New Roman"/>
@@ -412,6 +439,24 @@
     </w:p>
     <w:p>
       <w:pPr>
+        <w:rPr>
+          <w:rFonts w:ascii="Times New Roman" w:eastAsia="Times New Roman" w:hAnsi="Times New Roman" w:cs="Times New Roman"/>
+          <w:b/>
+          <w:bCs/>
+          <w:kern w:val="0"/>
+          <w14:ligatures w14:val="none"/>
+        </w:rPr>
+      </w:pPr>
+      <w:r>
+        <w:rPr>
+          <w:b/>
+          <w:bCs/>
+        </w:rPr>
+        <w:br w:type="page"/>
+      </w:r>
+    </w:p>
+    <w:p>
+      <w:pPr>
         <w:pStyle w:val="NormalWeb"/>
         <w:spacing w:before="0" w:beforeAutospacing="0" w:after="160" w:afterAutospacing="0"/>
         <w:jc w:val="both"/>
@@ -421,11 +466,19 @@
           <w:b/>
           <w:bCs/>
         </w:rPr>
+        <w:lastRenderedPageBreak/>
         <w:t>xServices</w:t>
       </w:r>
       <w:r>
         <w:t xml:space="preserve"> </w:t>
       </w:r>
+    </w:p>
+    <w:p>
+      <w:pPr>
+        <w:pStyle w:val="NormalWeb"/>
+        <w:spacing w:before="0" w:beforeAutospacing="0" w:after="160" w:afterAutospacing="0"/>
+        <w:jc w:val="both"/>
+      </w:pPr>
       <w:r>
         <w:rPr>
           <w:i/>
@@ -445,11 +498,7 @@
         <w:jc w:val="both"/>
       </w:pPr>
       <w:r>
-        <w:t xml:space="preserve">Acted as Lead Network Engineer for the high-profile "Universidad de la Libertad" (Grupo Salinas) project, executing the end-to-end configuration and deployment of the campus </w:t>
-      </w:r>
-      <w:r>
-        <w:lastRenderedPageBreak/>
-        <w:t>infrastructure, encompassing advanced Routing, Switching, and massive Wi-Fi environments.</w:t>
+        <w:t>Acted as Lead Network Engineer for the high-profile "Universidad de la Libertad" (Grupo Salinas) project, executing the end-to-end configuration and deployment of the campus infrastructure, encompassing advanced Routing, Switching, and massive Wi-Fi environments.</w:t>
       </w:r>
     </w:p>
     <w:p>
@@ -522,6 +571,17 @@
         </w:rPr>
         <w:t xml:space="preserve"> </w:t>
       </w:r>
+    </w:p>
+    <w:p>
+      <w:pPr>
+        <w:spacing w:line="240" w:lineRule="auto"/>
+        <w:jc w:val="both"/>
+        <w:rPr>
+          <w:rFonts w:ascii="Times New Roman" w:eastAsia="Times New Roman" w:hAnsi="Times New Roman" w:cs="Times New Roman"/>
+          <w:kern w:val="0"/>
+          <w14:ligatures w14:val="none"/>
+        </w:rPr>
+      </w:pPr>
       <w:r>
         <w:rPr>
           <w:rFonts w:ascii="Times New Roman" w:eastAsia="Times New Roman" w:hAnsi="Times New Roman" w:cs="Times New Roman"/>
@@ -630,6 +690,17 @@
         </w:rPr>
         <w:t xml:space="preserve"> </w:t>
       </w:r>
+    </w:p>
+    <w:p>
+      <w:pPr>
+        <w:spacing w:line="240" w:lineRule="auto"/>
+        <w:jc w:val="both"/>
+        <w:rPr>
+          <w:rFonts w:ascii="Times New Roman" w:eastAsia="Times New Roman" w:hAnsi="Times New Roman" w:cs="Times New Roman"/>
+          <w:kern w:val="0"/>
+          <w14:ligatures w14:val="none"/>
+        </w:rPr>
+      </w:pPr>
       <w:r>
         <w:rPr>
           <w:rFonts w:ascii="Times New Roman" w:eastAsia="Times New Roman" w:hAnsi="Times New Roman" w:cs="Times New Roman"/>
@@ -754,7 +825,26 @@
           <w:kern w:val="0"/>
           <w14:ligatures w14:val="none"/>
         </w:rPr>
-        <w:t xml:space="preserve"> B.S. in Telecommunications, Systems, and Electronics Engineering | Specialty in Telecommunications</w:t>
+        <w:t xml:space="preserve"> </w:t>
+      </w:r>
+    </w:p>
+    <w:p>
+      <w:pPr>
+        <w:spacing w:line="240" w:lineRule="auto"/>
+        <w:jc w:val="both"/>
+        <w:rPr>
+          <w:rFonts w:ascii="Times New Roman" w:eastAsia="Times New Roman" w:hAnsi="Times New Roman" w:cs="Times New Roman"/>
+          <w:kern w:val="0"/>
+          <w14:ligatures w14:val="none"/>
+        </w:rPr>
+      </w:pPr>
+      <w:r>
+        <w:rPr>
+          <w:rFonts w:ascii="Times New Roman" w:eastAsia="Times New Roman" w:hAnsi="Times New Roman" w:cs="Times New Roman"/>
+          <w:kern w:val="0"/>
+          <w14:ligatures w14:val="none"/>
+        </w:rPr>
+        <w:t>B.S. in Telecommunications, Systems, and Electronics Engineering | Specialty in Telecommunications</w:t>
       </w:r>
     </w:p>
     <w:p>
@@ -866,6 +956,7 @@
           <w:kern w:val="0"/>
           <w14:ligatures w14:val="none"/>
         </w:rPr>
+        <w:lastRenderedPageBreak/>
         <w:t>FCIA-Server</w:t>
       </w:r>
       <w:r>
@@ -1022,7 +1113,6 @@
           <w:kern w:val="0"/>
           <w14:ligatures w14:val="none"/>
         </w:rPr>
-        <w:lastRenderedPageBreak/>
         <w:t>Spanish:</w:t>
       </w:r>
       <w:r>

</xml_diff>

<commit_message>
Refactor: Limpieza de CSS inline y ajuste de resolucion para 4 columnas en desktop
</commit_message>
<xml_diff>
--- a/cv/Jose_Cruz_CV_EN.docx
+++ b/cv/Jose_Cruz_CV_EN.docx
@@ -870,171 +870,324 @@
     </w:p>
     <w:p>
       <w:pPr>
+        <w:pStyle w:val="ListParagraph"/>
         <w:numPr>
           <w:ilvl w:val="0"/>
-          <w:numId w:val="5"/>
+          <w:numId w:val="8"/>
         </w:numPr>
-        <w:spacing w:line="240" w:lineRule="auto"/>
-        <w:jc w:val="both"/>
-        <w:rPr>
-          <w:rFonts w:ascii="Times New Roman" w:eastAsia="Times New Roman" w:hAnsi="Times New Roman" w:cs="Times New Roman"/>
-          <w:kern w:val="0"/>
-          <w14:ligatures w14:val="none"/>
-        </w:rPr>
-      </w:pPr>
-      <w:r>
-        <w:rPr>
-          <w:rFonts w:ascii="Times New Roman" w:eastAsia="Times New Roman" w:hAnsi="Times New Roman" w:cs="Times New Roman"/>
+        <w:rPr>
+          <w:rFonts w:ascii="Times New Roman" w:eastAsia="Calibri" w:hAnsi="Times New Roman" w:cs="Times New Roman"/>
+          <w:b/>
+          <w:spacing w:val="-1"/>
+        </w:rPr>
+      </w:pPr>
+      <w:r>
+        <w:rPr>
+          <w:rFonts w:ascii="Times New Roman" w:eastAsia="Calibri" w:hAnsi="Times New Roman" w:cs="Times New Roman"/>
+          <w:b/>
+          <w:spacing w:val="-1"/>
+        </w:rPr>
+        <w:t xml:space="preserve">CCNA (Cisco Certified Network Associate) - </w:t>
+      </w:r>
+      <w:r>
+        <w:rPr>
+          <w:rFonts w:ascii="Times New Roman" w:eastAsia="Calibri" w:hAnsi="Times New Roman" w:cs="Times New Roman"/>
+          <w:spacing w:val="-1"/>
+        </w:rPr>
+        <w:t>ID: JGD3LSTGYH441YWJ</w:t>
+      </w:r>
+    </w:p>
+    <w:p>
+      <w:pPr>
+        <w:pStyle w:val="ListParagraph"/>
+        <w:numPr>
+          <w:ilvl w:val="0"/>
+          <w:numId w:val="8"/>
+        </w:numPr>
+        <w:rPr>
+          <w:rFonts w:ascii="Times New Roman" w:eastAsia="Calibri" w:hAnsi="Times New Roman" w:cs="Times New Roman"/>
+          <w:b/>
+          <w:u w:val="single" w:color="000000"/>
+        </w:rPr>
+      </w:pPr>
+      <w:r>
+        <w:rPr>
+          <w:rFonts w:ascii="Times New Roman" w:eastAsia="Calibri" w:hAnsi="Times New Roman" w:cs="Times New Roman"/>
+          <w:b/>
+        </w:rPr>
+        <w:t xml:space="preserve">HCIA (Huawei Certified ICT Associate) Datacom - </w:t>
+      </w:r>
+      <w:r>
+        <w:rPr>
+          <w:rFonts w:ascii="Times New Roman" w:eastAsia="Calibri" w:hAnsi="Times New Roman" w:cs="Times New Roman"/>
+          <w:spacing w:val="-1"/>
+          <w:lang w:val="en-US"/>
+        </w:rPr>
+        <w:t>ID: 010100101521808034771409</w:t>
+      </w:r>
+    </w:p>
+    <w:p>
+      <w:pPr>
+        <w:pStyle w:val="ListParagraph"/>
+        <w:numPr>
+          <w:ilvl w:val="0"/>
+          <w:numId w:val="8"/>
+        </w:numPr>
+        <w:rPr>
+          <w:rFonts w:ascii="Times New Roman" w:eastAsia="Calibri" w:hAnsi="Times New Roman" w:cs="Times New Roman"/>
+          <w:spacing w:val="-1"/>
+          <w:lang w:val="en-US"/>
+        </w:rPr>
+      </w:pPr>
+      <w:r>
+        <w:rPr>
+          <w:rFonts w:ascii="Times New Roman" w:eastAsia="Calibri" w:hAnsi="Times New Roman" w:cs="Times New Roman"/>
+          <w:b/>
+        </w:rPr>
+        <w:lastRenderedPageBreak/>
+        <w:t xml:space="preserve">HCSA-Presales service - </w:t>
+      </w:r>
+      <w:r>
+        <w:rPr>
+          <w:rFonts w:ascii="Times New Roman" w:eastAsia="Calibri" w:hAnsi="Times New Roman" w:cs="Times New Roman"/>
+          <w:spacing w:val="-1"/>
+        </w:rPr>
+        <w:t>ID: 03221201809250891409</w:t>
+      </w:r>
+    </w:p>
+    <w:p>
+      <w:pPr>
+        <w:pStyle w:val="ListParagraph"/>
+        <w:numPr>
+          <w:ilvl w:val="0"/>
+          <w:numId w:val="8"/>
+        </w:numPr>
+        <w:rPr>
+          <w:rFonts w:ascii="Times New Roman" w:eastAsia="Calibri" w:hAnsi="Times New Roman" w:cs="Times New Roman"/>
+          <w:spacing w:val="-1"/>
+        </w:rPr>
+      </w:pPr>
+      <w:r>
+        <w:rPr>
+          <w:rFonts w:ascii="Times New Roman" w:eastAsia="Calibri" w:hAnsi="Times New Roman" w:cs="Times New Roman"/>
           <w:b/>
           <w:bCs/>
-          <w:kern w:val="0"/>
-          <w14:ligatures w14:val="none"/>
-        </w:rPr>
-        <w:t>CCNA</w:t>
-      </w:r>
-      <w:r>
-        <w:rPr>
-          <w:rFonts w:ascii="Times New Roman" w:eastAsia="Times New Roman" w:hAnsi="Times New Roman" w:cs="Times New Roman"/>
-          <w:kern w:val="0"/>
-          <w14:ligatures w14:val="none"/>
-        </w:rPr>
-        <w:t xml:space="preserve"> (Cisco Certified Network Associate) – ID: JGD3LSTGYH441YWJ</w:t>
-      </w:r>
-    </w:p>
-    <w:p>
-      <w:pPr>
+          <w:spacing w:val="-1"/>
+        </w:rPr>
+        <w:t xml:space="preserve">Cyber Security Certificate for the Subcontractor Resources - </w:t>
+      </w:r>
+      <w:r>
+        <w:rPr>
+          <w:rFonts w:ascii="Times New Roman" w:eastAsia="Calibri" w:hAnsi="Times New Roman" w:cs="Times New Roman"/>
+          <w:spacing w:val="-1"/>
+          <w:lang w:val="en-US"/>
+        </w:rPr>
+        <w:t xml:space="preserve">ID: </w:t>
+      </w:r>
+      <w:r>
+        <w:rPr>
+          <w:rFonts w:ascii="Times New Roman" w:eastAsia="Calibri" w:hAnsi="Times New Roman" w:cs="Times New Roman"/>
+          <w:spacing w:val="-1"/>
+        </w:rPr>
+        <w:t xml:space="preserve">01010101521809651011409 </w:t>
+      </w:r>
+    </w:p>
+    <w:p>
+      <w:pPr>
+        <w:pStyle w:val="ListParagraph"/>
         <w:numPr>
           <w:ilvl w:val="0"/>
-          <w:numId w:val="5"/>
+          <w:numId w:val="8"/>
         </w:numPr>
-        <w:spacing w:line="240" w:lineRule="auto"/>
-        <w:jc w:val="both"/>
-        <w:rPr>
-          <w:rFonts w:ascii="Times New Roman" w:eastAsia="Times New Roman" w:hAnsi="Times New Roman" w:cs="Times New Roman"/>
-          <w:kern w:val="0"/>
-          <w14:ligatures w14:val="none"/>
-        </w:rPr>
-      </w:pPr>
-      <w:r>
-        <w:rPr>
-          <w:rFonts w:ascii="Times New Roman" w:eastAsia="Times New Roman" w:hAnsi="Times New Roman" w:cs="Times New Roman"/>
+        <w:rPr>
+          <w:rFonts w:ascii="Times New Roman" w:eastAsia="Calibri" w:hAnsi="Times New Roman" w:cs="Times New Roman"/>
+          <w:spacing w:val="-1"/>
+        </w:rPr>
+      </w:pPr>
+      <w:r>
+        <w:rPr>
+          <w:rFonts w:ascii="Times New Roman" w:eastAsia="Calibri" w:hAnsi="Times New Roman" w:cs="Times New Roman"/>
           <w:b/>
           <w:bCs/>
-          <w:kern w:val="0"/>
-          <w14:ligatures w14:val="none"/>
-        </w:rPr>
-        <w:t>HCIA</w:t>
-      </w:r>
-      <w:r>
-        <w:rPr>
-          <w:rFonts w:ascii="Times New Roman" w:eastAsia="Times New Roman" w:hAnsi="Times New Roman" w:cs="Times New Roman"/>
-          <w:kern w:val="0"/>
-          <w14:ligatures w14:val="none"/>
-        </w:rPr>
-        <w:t xml:space="preserve"> (Huawei Certified ICT Associate) Datacom – ID: 010100101521808034771409</w:t>
-      </w:r>
-    </w:p>
-    <w:p>
-      <w:pPr>
+          <w:spacing w:val="-1"/>
+        </w:rPr>
+        <w:t xml:space="preserve">HCSA-Presales-IP Network - </w:t>
+      </w:r>
+      <w:r>
+        <w:rPr>
+          <w:rFonts w:ascii="Times New Roman" w:eastAsia="Calibri" w:hAnsi="Times New Roman" w:cs="Times New Roman"/>
+          <w:spacing w:val="-1"/>
+          <w:lang w:val="es-MX"/>
+        </w:rPr>
+        <w:t xml:space="preserve">ID: </w:t>
+      </w:r>
+      <w:r>
+        <w:rPr>
+          <w:rFonts w:ascii="Times New Roman" w:eastAsia="Calibri" w:hAnsi="Times New Roman" w:cs="Times New Roman"/>
+          <w:spacing w:val="-1"/>
+        </w:rPr>
+        <w:t>03221601808842611790485</w:t>
+      </w:r>
+    </w:p>
+    <w:p>
+      <w:pPr>
+        <w:pStyle w:val="ListParagraph"/>
         <w:numPr>
           <w:ilvl w:val="0"/>
-          <w:numId w:val="5"/>
+          <w:numId w:val="8"/>
         </w:numPr>
-        <w:spacing w:line="240" w:lineRule="auto"/>
-        <w:jc w:val="both"/>
-        <w:rPr>
-          <w:rFonts w:ascii="Times New Roman" w:eastAsia="Times New Roman" w:hAnsi="Times New Roman" w:cs="Times New Roman"/>
-          <w:kern w:val="0"/>
-          <w14:ligatures w14:val="none"/>
-        </w:rPr>
-      </w:pPr>
-      <w:r>
-        <w:rPr>
-          <w:rFonts w:ascii="Times New Roman" w:eastAsia="Times New Roman" w:hAnsi="Times New Roman" w:cs="Times New Roman"/>
+        <w:rPr>
+          <w:rFonts w:ascii="Times New Roman" w:eastAsia="Calibri" w:hAnsi="Times New Roman" w:cs="Times New Roman"/>
+          <w:spacing w:val="-1"/>
+        </w:rPr>
+      </w:pPr>
+      <w:r>
+        <w:rPr>
+          <w:rFonts w:ascii="Times New Roman" w:eastAsia="Calibri" w:hAnsi="Times New Roman" w:cs="Times New Roman"/>
           <w:b/>
           <w:bCs/>
-          <w:kern w:val="0"/>
-          <w14:ligatures w14:val="none"/>
-        </w:rPr>
-        <w:lastRenderedPageBreak/>
-        <w:t>FCIA-Server</w:t>
-      </w:r>
-      <w:r>
-        <w:rPr>
-          <w:rFonts w:ascii="Times New Roman" w:eastAsia="Times New Roman" w:hAnsi="Times New Roman" w:cs="Times New Roman"/>
-          <w:kern w:val="0"/>
-          <w14:ligatures w14:val="none"/>
-        </w:rPr>
-        <w:t xml:space="preserve"> – ID: XFU01FCIA010011</w:t>
-      </w:r>
-    </w:p>
-    <w:p>
-      <w:pPr>
+          <w:spacing w:val="-1"/>
+        </w:rPr>
+        <w:t xml:space="preserve">HCSA-Presales-Storage - </w:t>
+      </w:r>
+      <w:r>
+        <w:rPr>
+          <w:rFonts w:ascii="Times New Roman" w:eastAsia="Calibri" w:hAnsi="Times New Roman" w:cs="Times New Roman"/>
+          <w:spacing w:val="-1"/>
+          <w:lang w:val="es-MX"/>
+        </w:rPr>
+        <w:t xml:space="preserve">ID: </w:t>
+      </w:r>
+      <w:r>
+        <w:rPr>
+          <w:rFonts w:ascii="Times New Roman" w:eastAsia="Calibri" w:hAnsi="Times New Roman" w:cs="Times New Roman"/>
+          <w:spacing w:val="-1"/>
+        </w:rPr>
+        <w:t>03221701808850891924534</w:t>
+      </w:r>
+    </w:p>
+    <w:p>
+      <w:pPr>
+        <w:pStyle w:val="ListParagraph"/>
         <w:numPr>
           <w:ilvl w:val="0"/>
-          <w:numId w:val="5"/>
+          <w:numId w:val="8"/>
         </w:numPr>
-        <w:spacing w:line="240" w:lineRule="auto"/>
-        <w:jc w:val="both"/>
-        <w:rPr>
-          <w:rFonts w:ascii="Times New Roman" w:eastAsia="Times New Roman" w:hAnsi="Times New Roman" w:cs="Times New Roman"/>
-          <w:kern w:val="0"/>
-          <w14:ligatures w14:val="none"/>
-        </w:rPr>
-      </w:pPr>
-      <w:r>
-        <w:rPr>
-          <w:rFonts w:ascii="Times New Roman" w:eastAsia="Times New Roman" w:hAnsi="Times New Roman" w:cs="Times New Roman"/>
-          <w:kern w:val="0"/>
-          <w14:ligatures w14:val="none"/>
-        </w:rPr>
-        <w:t>HCSA-Presales Service / IP Network / Storage</w:t>
-      </w:r>
-    </w:p>
-    <w:p>
-      <w:pPr>
+        <w:rPr>
+          <w:rFonts w:ascii="Times New Roman" w:eastAsia="Calibri" w:hAnsi="Times New Roman" w:cs="Times New Roman"/>
+          <w:b/>
+          <w:bCs/>
+          <w:spacing w:val="-1"/>
+        </w:rPr>
+      </w:pPr>
+      <w:r>
+        <w:rPr>
+          <w:rFonts w:ascii="Times New Roman" w:eastAsia="Calibri" w:hAnsi="Times New Roman" w:cs="Times New Roman"/>
+          <w:b/>
+          <w:bCs/>
+          <w:spacing w:val="-1"/>
+        </w:rPr>
+        <w:t xml:space="preserve">FCIA-Server - </w:t>
+      </w:r>
+      <w:r>
+        <w:rPr>
+          <w:rFonts w:ascii="Times New Roman" w:eastAsia="Calibri" w:hAnsi="Times New Roman" w:cs="Times New Roman"/>
+          <w:spacing w:val="-1"/>
+        </w:rPr>
+        <w:t>ID: XFU01FCIA010011</w:t>
+      </w:r>
+    </w:p>
+    <w:p>
+      <w:pPr>
+        <w:pStyle w:val="ListParagraph"/>
         <w:numPr>
           <w:ilvl w:val="0"/>
-          <w:numId w:val="5"/>
+          <w:numId w:val="8"/>
         </w:numPr>
-        <w:spacing w:line="240" w:lineRule="auto"/>
-        <w:jc w:val="both"/>
-        <w:rPr>
-          <w:rFonts w:ascii="Times New Roman" w:eastAsia="Times New Roman" w:hAnsi="Times New Roman" w:cs="Times New Roman"/>
-          <w:kern w:val="0"/>
-          <w14:ligatures w14:val="none"/>
-        </w:rPr>
-      </w:pPr>
-      <w:r>
-        <w:rPr>
-          <w:rFonts w:ascii="Times New Roman" w:eastAsia="Times New Roman" w:hAnsi="Times New Roman" w:cs="Times New Roman"/>
-          <w:kern w:val="0"/>
-          <w14:ligatures w14:val="none"/>
-        </w:rPr>
-        <w:t>Cyber Security Certificate for Subcontractor Resources</w:t>
-      </w:r>
-    </w:p>
-    <w:p>
-      <w:pPr>
+        <w:rPr>
+          <w:rFonts w:ascii="Times New Roman" w:eastAsia="Calibri" w:hAnsi="Times New Roman" w:cs="Times New Roman"/>
+          <w:b/>
+          <w:bCs/>
+          <w:spacing w:val="-1"/>
+        </w:rPr>
+      </w:pPr>
+      <w:r>
+        <w:rPr>
+          <w:rFonts w:ascii="Times New Roman" w:eastAsia="Calibri" w:hAnsi="Times New Roman" w:cs="Times New Roman"/>
+          <w:b/>
+          <w:bCs/>
+          <w:spacing w:val="-1"/>
+        </w:rPr>
+        <w:t xml:space="preserve">FCS-Pre sales - </w:t>
+      </w:r>
+      <w:r>
+        <w:rPr>
+          <w:rFonts w:ascii="Times New Roman" w:eastAsia="Calibri" w:hAnsi="Times New Roman" w:cs="Times New Roman"/>
+          <w:spacing w:val="-1"/>
+        </w:rPr>
+        <w:t>ID: XFU01FCSPresales000198</w:t>
+      </w:r>
+    </w:p>
+    <w:p>
+      <w:pPr>
+        <w:pStyle w:val="ListParagraph"/>
         <w:numPr>
           <w:ilvl w:val="0"/>
-          <w:numId w:val="5"/>
+          <w:numId w:val="8"/>
         </w:numPr>
-        <w:spacing w:line="240" w:lineRule="auto"/>
-        <w:jc w:val="both"/>
-        <w:rPr>
-          <w:rFonts w:ascii="Times New Roman" w:eastAsia="Times New Roman" w:hAnsi="Times New Roman" w:cs="Times New Roman"/>
-          <w:kern w:val="0"/>
-          <w14:ligatures w14:val="none"/>
-        </w:rPr>
-      </w:pPr>
-      <w:r>
-        <w:rPr>
-          <w:rFonts w:ascii="Times New Roman" w:eastAsia="Times New Roman" w:hAnsi="Times New Roman" w:cs="Times New Roman"/>
-          <w:kern w:val="0"/>
-          <w14:ligatures w14:val="none"/>
-        </w:rPr>
-        <w:t>FCS-Pre sales &amp; Solution</w:t>
+        <w:rPr>
+          <w:rFonts w:ascii="Times New Roman" w:eastAsia="Calibri" w:hAnsi="Times New Roman" w:cs="Times New Roman"/>
+          <w:b/>
+          <w:bCs/>
+          <w:spacing w:val="-1"/>
+        </w:rPr>
+      </w:pPr>
+      <w:r>
+        <w:rPr>
+          <w:rFonts w:ascii="Times New Roman" w:eastAsia="Calibri" w:hAnsi="Times New Roman" w:cs="Times New Roman"/>
+          <w:b/>
+          <w:bCs/>
+          <w:spacing w:val="-1"/>
+        </w:rPr>
+        <w:t xml:space="preserve">FCS-Solution - </w:t>
+      </w:r>
+      <w:r>
+        <w:rPr>
+          <w:rFonts w:ascii="Times New Roman" w:eastAsia="Calibri" w:hAnsi="Times New Roman" w:cs="Times New Roman"/>
+          <w:spacing w:val="-1"/>
+        </w:rPr>
+        <w:t>ID: XFU01FCSSolution000111</w:t>
+      </w:r>
+    </w:p>
+    <w:p>
+      <w:pPr>
+        <w:pStyle w:val="ListParagraph"/>
+        <w:numPr>
+          <w:ilvl w:val="0"/>
+          <w:numId w:val="8"/>
+        </w:numPr>
+        <w:rPr>
+          <w:rFonts w:ascii="Times New Roman" w:eastAsia="Calibri" w:hAnsi="Times New Roman" w:cs="Times New Roman"/>
+          <w:b/>
+          <w:bCs/>
+          <w:spacing w:val="-1"/>
+        </w:rPr>
+      </w:pPr>
+      <w:r>
+        <w:rPr>
+          <w:rFonts w:ascii="Times New Roman" w:eastAsia="Calibri" w:hAnsi="Times New Roman" w:cs="Times New Roman"/>
+          <w:b/>
+          <w:bCs/>
+          <w:spacing w:val="-1"/>
+        </w:rPr>
+        <w:t xml:space="preserve">ITIL V4 Foundations – </w:t>
+      </w:r>
+      <w:r>
+        <w:rPr>
+          <w:rFonts w:ascii="Times New Roman" w:eastAsia="Calibri" w:hAnsi="Times New Roman" w:cs="Times New Roman"/>
+          <w:spacing w:val="-1"/>
+        </w:rPr>
+        <w:t>ID GR671868321JC</w:t>
       </w:r>
     </w:p>
     <w:p>
@@ -1436,6 +1589,155 @@
     </w:lvl>
   </w:abstractNum>
   <w:abstractNum w:abstractNumId="2" w15:restartNumberingAfterBreak="0">
+    <w:nsid w:val="29BA7412"/>
+    <w:multiLevelType w:val="multilevel"/>
+    <w:tmpl w:val="2D580A8E"/>
+    <w:lvl w:ilvl="0">
+      <w:start w:val="1"/>
+      <w:numFmt w:val="bullet"/>
+      <w:lvlText w:val=""/>
+      <w:lvlJc w:val="left"/>
+      <w:pPr>
+        <w:tabs>
+          <w:tab w:val="num" w:pos="720"/>
+        </w:tabs>
+        <w:ind w:left="720" w:hanging="360"/>
+      </w:pPr>
+      <w:rPr>
+        <w:rFonts w:ascii="Symbol" w:hAnsi="Symbol" w:hint="default"/>
+        <w:sz w:val="20"/>
+      </w:rPr>
+    </w:lvl>
+    <w:lvl w:ilvl="1" w:tentative="1">
+      <w:start w:val="1"/>
+      <w:numFmt w:val="bullet"/>
+      <w:lvlText w:val="o"/>
+      <w:lvlJc w:val="left"/>
+      <w:pPr>
+        <w:tabs>
+          <w:tab w:val="num" w:pos="1440"/>
+        </w:tabs>
+        <w:ind w:left="1440" w:hanging="360"/>
+      </w:pPr>
+      <w:rPr>
+        <w:rFonts w:ascii="Courier New" w:hAnsi="Courier New" w:hint="default"/>
+        <w:sz w:val="20"/>
+      </w:rPr>
+    </w:lvl>
+    <w:lvl w:ilvl="2" w:tentative="1">
+      <w:start w:val="1"/>
+      <w:numFmt w:val="bullet"/>
+      <w:lvlText w:val=""/>
+      <w:lvlJc w:val="left"/>
+      <w:pPr>
+        <w:tabs>
+          <w:tab w:val="num" w:pos="2160"/>
+        </w:tabs>
+        <w:ind w:left="2160" w:hanging="360"/>
+      </w:pPr>
+      <w:rPr>
+        <w:rFonts w:ascii="Wingdings" w:hAnsi="Wingdings" w:hint="default"/>
+        <w:sz w:val="20"/>
+      </w:rPr>
+    </w:lvl>
+    <w:lvl w:ilvl="3" w:tentative="1">
+      <w:start w:val="1"/>
+      <w:numFmt w:val="bullet"/>
+      <w:lvlText w:val=""/>
+      <w:lvlJc w:val="left"/>
+      <w:pPr>
+        <w:tabs>
+          <w:tab w:val="num" w:pos="2880"/>
+        </w:tabs>
+        <w:ind w:left="2880" w:hanging="360"/>
+      </w:pPr>
+      <w:rPr>
+        <w:rFonts w:ascii="Wingdings" w:hAnsi="Wingdings" w:hint="default"/>
+        <w:sz w:val="20"/>
+      </w:rPr>
+    </w:lvl>
+    <w:lvl w:ilvl="4" w:tentative="1">
+      <w:start w:val="1"/>
+      <w:numFmt w:val="bullet"/>
+      <w:lvlText w:val=""/>
+      <w:lvlJc w:val="left"/>
+      <w:pPr>
+        <w:tabs>
+          <w:tab w:val="num" w:pos="3600"/>
+        </w:tabs>
+        <w:ind w:left="3600" w:hanging="360"/>
+      </w:pPr>
+      <w:rPr>
+        <w:rFonts w:ascii="Wingdings" w:hAnsi="Wingdings" w:hint="default"/>
+        <w:sz w:val="20"/>
+      </w:rPr>
+    </w:lvl>
+    <w:lvl w:ilvl="5" w:tentative="1">
+      <w:start w:val="1"/>
+      <w:numFmt w:val="bullet"/>
+      <w:lvlText w:val=""/>
+      <w:lvlJc w:val="left"/>
+      <w:pPr>
+        <w:tabs>
+          <w:tab w:val="num" w:pos="4320"/>
+        </w:tabs>
+        <w:ind w:left="4320" w:hanging="360"/>
+      </w:pPr>
+      <w:rPr>
+        <w:rFonts w:ascii="Wingdings" w:hAnsi="Wingdings" w:hint="default"/>
+        <w:sz w:val="20"/>
+      </w:rPr>
+    </w:lvl>
+    <w:lvl w:ilvl="6" w:tentative="1">
+      <w:start w:val="1"/>
+      <w:numFmt w:val="bullet"/>
+      <w:lvlText w:val=""/>
+      <w:lvlJc w:val="left"/>
+      <w:pPr>
+        <w:tabs>
+          <w:tab w:val="num" w:pos="5040"/>
+        </w:tabs>
+        <w:ind w:left="5040" w:hanging="360"/>
+      </w:pPr>
+      <w:rPr>
+        <w:rFonts w:ascii="Wingdings" w:hAnsi="Wingdings" w:hint="default"/>
+        <w:sz w:val="20"/>
+      </w:rPr>
+    </w:lvl>
+    <w:lvl w:ilvl="7" w:tentative="1">
+      <w:start w:val="1"/>
+      <w:numFmt w:val="bullet"/>
+      <w:lvlText w:val=""/>
+      <w:lvlJc w:val="left"/>
+      <w:pPr>
+        <w:tabs>
+          <w:tab w:val="num" w:pos="5760"/>
+        </w:tabs>
+        <w:ind w:left="5760" w:hanging="360"/>
+      </w:pPr>
+      <w:rPr>
+        <w:rFonts w:ascii="Wingdings" w:hAnsi="Wingdings" w:hint="default"/>
+        <w:sz w:val="20"/>
+      </w:rPr>
+    </w:lvl>
+    <w:lvl w:ilvl="8" w:tentative="1">
+      <w:start w:val="1"/>
+      <w:numFmt w:val="bullet"/>
+      <w:lvlText w:val=""/>
+      <w:lvlJc w:val="left"/>
+      <w:pPr>
+        <w:tabs>
+          <w:tab w:val="num" w:pos="6480"/>
+        </w:tabs>
+        <w:ind w:left="6480" w:hanging="360"/>
+      </w:pPr>
+      <w:rPr>
+        <w:rFonts w:ascii="Wingdings" w:hAnsi="Wingdings" w:hint="default"/>
+        <w:sz w:val="20"/>
+      </w:rPr>
+    </w:lvl>
+  </w:abstractNum>
+  <w:abstractNum w:abstractNumId="3" w15:restartNumberingAfterBreak="0">
     <w:nsid w:val="34F26ED9"/>
     <w:multiLevelType w:val="multilevel"/>
     <w:tmpl w:val="759A342E"/>
@@ -1584,7 +1886,7 @@
       </w:rPr>
     </w:lvl>
   </w:abstractNum>
-  <w:abstractNum w:abstractNumId="3" w15:restartNumberingAfterBreak="0">
+  <w:abstractNum w:abstractNumId="4" w15:restartNumberingAfterBreak="0">
     <w:nsid w:val="48B914C2"/>
     <w:multiLevelType w:val="multilevel"/>
     <w:tmpl w:val="09520C92"/>
@@ -1733,7 +2035,7 @@
       </w:rPr>
     </w:lvl>
   </w:abstractNum>
-  <w:abstractNum w:abstractNumId="4" w15:restartNumberingAfterBreak="0">
+  <w:abstractNum w:abstractNumId="5" w15:restartNumberingAfterBreak="0">
     <w:nsid w:val="550A2074"/>
     <w:multiLevelType w:val="multilevel"/>
     <w:tmpl w:val="7D4AF468"/>
@@ -1882,7 +2184,7 @@
       </w:rPr>
     </w:lvl>
   </w:abstractNum>
-  <w:abstractNum w:abstractNumId="5" w15:restartNumberingAfterBreak="0">
+  <w:abstractNum w:abstractNumId="6" w15:restartNumberingAfterBreak="0">
     <w:nsid w:val="62216680"/>
     <w:multiLevelType w:val="multilevel"/>
     <w:tmpl w:val="029454B8"/>
@@ -2031,7 +2333,7 @@
       </w:rPr>
     </w:lvl>
   </w:abstractNum>
-  <w:abstractNum w:abstractNumId="6" w15:restartNumberingAfterBreak="0">
+  <w:abstractNum w:abstractNumId="7" w15:restartNumberingAfterBreak="0">
     <w:nsid w:val="6CE84026"/>
     <w:multiLevelType w:val="multilevel"/>
     <w:tmpl w:val="6D861B28"/>
@@ -2181,10 +2483,10 @@
     </w:lvl>
   </w:abstractNum>
   <w:num w:numId="1" w16cid:durableId="1445928392">
-    <w:abstractNumId w:val="5"/>
+    <w:abstractNumId w:val="6"/>
   </w:num>
   <w:num w:numId="2" w16cid:durableId="466971908">
-    <w:abstractNumId w:val="2"/>
+    <w:abstractNumId w:val="3"/>
   </w:num>
   <w:num w:numId="3" w16cid:durableId="936327224">
     <w:abstractNumId w:val="1"/>
@@ -2193,13 +2495,16 @@
     <w:abstractNumId w:val="0"/>
   </w:num>
   <w:num w:numId="5" w16cid:durableId="20017412">
+    <w:abstractNumId w:val="5"/>
+  </w:num>
+  <w:num w:numId="6" w16cid:durableId="602807564">
+    <w:abstractNumId w:val="7"/>
+  </w:num>
+  <w:num w:numId="7" w16cid:durableId="1496921720">
     <w:abstractNumId w:val="4"/>
   </w:num>
-  <w:num w:numId="6" w16cid:durableId="602807564">
-    <w:abstractNumId w:val="6"/>
-  </w:num>
-  <w:num w:numId="7" w16cid:durableId="1496921720">
-    <w:abstractNumId w:val="3"/>
+  <w:num w:numId="8" w16cid:durableId="775176094">
+    <w:abstractNumId w:val="2"/>
   </w:num>
 </w:numbering>
 </file>

</xml_diff>